<commit_message>
Update Creazione di una rete segmentata.docx
</commit_message>
<xml_diff>
--- a/S1:L5/Creazione di una rete segmentata.docx
+++ b/S1:L5/Creazione di una rete segmentata.docx
@@ -12,6 +12,14 @@
     </w:p>
     <w:sdt>
       <w:sdtPr>
+        <w:rPr>
+          <w:rFonts w:asciiTheme="minorHAnsi" w:eastAsiaTheme="minorEastAsia" w:hAnsiTheme="minorHAnsi" w:cstheme="minorBidi"/>
+          <w:b w:val="0"/>
+          <w:bCs w:val="0"/>
+          <w:color w:val="auto"/>
+          <w:sz w:val="22"/>
+          <w:szCs w:val="22"/>
+        </w:rPr>
         <w:id w:val="-351033579"/>
         <w:docPartObj>
           <w:docPartGallery w:val="Table of Contents"/>
@@ -20,11 +28,7 @@
       </w:sdtPr>
       <w:sdtEndPr>
         <w:rPr>
-          <w:rFonts w:asciiTheme="minorHAnsi" w:eastAsiaTheme="minorEastAsia" w:hAnsiTheme="minorHAnsi" w:cstheme="minorBidi"/>
           <w:noProof/>
-          <w:color w:val="auto"/>
-          <w:sz w:val="22"/>
-          <w:szCs w:val="22"/>
         </w:rPr>
       </w:sdtEndPr>
       <w:sdtContent>
@@ -98,21 +102,7 @@
                 <w:rStyle w:val="Collegamentoipertestuale"/>
                 <w:noProof/>
               </w:rPr>
-              <w:t>Scopo de</w:t>
-            </w:r>
-            <w:r>
-              <w:rPr>
-                <w:rStyle w:val="Collegamentoipertestuale"/>
-                <w:noProof/>
-              </w:rPr>
-              <w:t>l</w:t>
-            </w:r>
-            <w:r>
-              <w:rPr>
-                <w:rStyle w:val="Collegamentoipertestuale"/>
-                <w:noProof/>
-              </w:rPr>
-              <w:t xml:space="preserve"> progetto</w:t>
+              <w:t>Scopo del progetto</w:t>
             </w:r>
             <w:r>
               <w:rPr>
@@ -572,21 +562,7 @@
                 <w:rStyle w:val="Collegamentoipertestuale"/>
                 <w:noProof/>
               </w:rPr>
-              <w:t>Configurazi</w:t>
-            </w:r>
-            <w:r>
-              <w:rPr>
-                <w:rStyle w:val="Collegamentoipertestuale"/>
-                <w:noProof/>
-              </w:rPr>
-              <w:t>o</w:t>
-            </w:r>
-            <w:r>
-              <w:rPr>
-                <w:rStyle w:val="Collegamentoipertestuale"/>
-                <w:noProof/>
-              </w:rPr>
-              <w:t>ne host</w:t>
+              <w:t>Configurazione host</w:t>
             </w:r>
             <w:r>
               <w:rPr>
@@ -1022,19 +998,17 @@
       <w:r>
         <w:br w:type="page"/>
       </w:r>
-      <w:bookmarkStart w:id="0" w:name="_GoBack"/>
-      <w:bookmarkEnd w:id="0"/>
     </w:p>
     <w:p>
       <w:pPr>
         <w:pStyle w:val="Titolo1"/>
       </w:pPr>
-      <w:bookmarkStart w:id="1" w:name="_Toc226714190"/>
+      <w:bookmarkStart w:id="0" w:name="_Toc226714190"/>
       <w:r>
         <w:lastRenderedPageBreak/>
         <w:t>Scopo del progetto</w:t>
       </w:r>
-      <w:bookmarkEnd w:id="1"/>
+      <w:bookmarkEnd w:id="0"/>
       <w:r>
         <w:t xml:space="preserve"> </w:t>
       </w:r>
@@ -1100,11 +1074,11 @@
       <w:pPr>
         <w:pStyle w:val="Titolo1"/>
       </w:pPr>
-      <w:bookmarkStart w:id="2" w:name="_Toc226714191"/>
+      <w:bookmarkStart w:id="1" w:name="_Toc226714191"/>
       <w:r>
         <w:t>Topologia di rete</w:t>
       </w:r>
-      <w:bookmarkEnd w:id="2"/>
+      <w:bookmarkEnd w:id="1"/>
     </w:p>
     <w:p>
       <w:r>
@@ -1126,11 +1100,11 @@
       <w:pPr>
         <w:pStyle w:val="Titolo2"/>
       </w:pPr>
-      <w:bookmarkStart w:id="3" w:name="_Toc226714192"/>
+      <w:bookmarkStart w:id="2" w:name="_Toc226714192"/>
       <w:r>
         <w:t>Topologia utilizzata</w:t>
       </w:r>
-      <w:bookmarkEnd w:id="3"/>
+      <w:bookmarkEnd w:id="2"/>
       <w:r>
         <w:t xml:space="preserve"> </w:t>
       </w:r>
@@ -1193,7 +1167,7 @@
       <w:pPr>
         <w:pStyle w:val="Titolo2"/>
       </w:pPr>
-      <w:bookmarkStart w:id="4" w:name="_Toc226714193"/>
+      <w:bookmarkStart w:id="3" w:name="_Toc226714193"/>
       <w:r>
         <w:lastRenderedPageBreak/>
         <w:t>Indirizz</w:t>
@@ -1204,7 +1178,7 @@
       <w:r>
         <w:t xml:space="preserve"> IP</w:t>
       </w:r>
-      <w:bookmarkEnd w:id="4"/>
+      <w:bookmarkEnd w:id="3"/>
       <w:r>
         <w:t xml:space="preserve"> </w:t>
       </w:r>
@@ -1553,6 +1527,17 @@
               </w:rPr>
               <w:t>1</w:t>
             </w:r>
+            <w:r>
+              <w:rPr>
+                <w:rFonts w:ascii="Arial" w:eastAsia="Times New Roman" w:hAnsi="Arial" w:cs="Arial"/>
+                <w:b/>
+                <w:bCs/>
+                <w:sz w:val="24"/>
+                <w:szCs w:val="24"/>
+                <w:lang w:eastAsia="it-IT"/>
+              </w:rPr>
+              <w:t>0</w:t>
+            </w:r>
           </w:p>
         </w:tc>
         <w:tc>
@@ -2543,11 +2528,11 @@
       <w:pPr>
         <w:pStyle w:val="Titolo1"/>
       </w:pPr>
-      <w:bookmarkStart w:id="5" w:name="_Toc226714194"/>
+      <w:bookmarkStart w:id="4" w:name="_Toc226714194"/>
       <w:r>
         <w:t>Configurazione degli apparati</w:t>
       </w:r>
-      <w:bookmarkEnd w:id="5"/>
+      <w:bookmarkEnd w:id="4"/>
       <w:r>
         <w:t xml:space="preserve"> </w:t>
       </w:r>
@@ -2555,10 +2540,7 @@
     <w:p/>
     <w:p>
       <w:r>
-        <w:t>In questa sezione andremo ad analizzare nel dettaglio l</w:t>
-      </w:r>
-      <w:r>
-        <w:t xml:space="preserve">e configurazioni necessarie per la comunicazione tra </w:t>
+        <w:t xml:space="preserve">In questa sezione andremo ad analizzare nel dettaglio le configurazioni necessarie per la comunicazione tra </w:t>
       </w:r>
       <w:proofErr w:type="spellStart"/>
       <w:r>
@@ -2620,7 +2602,7 @@
       <w:pPr>
         <w:pStyle w:val="Titolo2"/>
       </w:pPr>
-      <w:bookmarkStart w:id="6" w:name="_Toc226714195"/>
+      <w:bookmarkStart w:id="5" w:name="_Toc226714195"/>
       <w:r>
         <w:t xml:space="preserve">Configurazione </w:t>
       </w:r>
@@ -2628,121 +2610,13 @@
       <w:r>
         <w:t>host</w:t>
       </w:r>
-      <w:bookmarkEnd w:id="6"/>
+      <w:bookmarkEnd w:id="5"/>
       <w:proofErr w:type="spellEnd"/>
       <w:r>
         <w:t xml:space="preserve"> </w:t>
       </w:r>
     </w:p>
-    <w:p>
-      <w:r>
-        <w:rPr>
-          <w:noProof/>
-        </w:rPr>
-        <mc:AlternateContent>
-          <mc:Choice Requires="wps">
-            <w:drawing>
-              <wp:anchor distT="0" distB="0" distL="114300" distR="114300" simplePos="0" relativeHeight="251659264" behindDoc="0" locked="0" layoutInCell="1" allowOverlap="1">
-                <wp:simplePos x="0" y="0"/>
-                <wp:positionH relativeFrom="column">
-                  <wp:posOffset>3260725</wp:posOffset>
-                </wp:positionH>
-                <wp:positionV relativeFrom="paragraph">
-                  <wp:posOffset>316656</wp:posOffset>
-                </wp:positionV>
-                <wp:extent cx="3281680" cy="844952"/>
-                <wp:effectExtent l="0" t="0" r="0" b="6350"/>
-                <wp:wrapNone/>
-                <wp:docPr id="3" name="Casella di testo 3"/>
-                <wp:cNvGraphicFramePr>
-                  <a:graphicFrameLocks xmlns:a="http://schemas.openxmlformats.org/drawingml/2006/main"/>
-                </wp:cNvGraphicFramePr>
-                <a:graphic xmlns:a="http://schemas.openxmlformats.org/drawingml/2006/main">
-                  <a:graphicData uri="http://schemas.microsoft.com/office/word/2010/wordprocessingShape">
-                    <wps:wsp>
-                      <wps:cNvSpPr txBox="1">
-                        <a:spLocks/>
-                      </wps:cNvSpPr>
-                      <wps:spPr>
-                        <a:xfrm>
-                          <a:off x="0" y="0"/>
-                          <a:ext cx="3281680" cy="844952"/>
-                        </a:xfrm>
-                        <a:prstGeom prst="rect">
-                          <a:avLst/>
-                        </a:prstGeom>
-                        <a:solidFill>
-                          <a:schemeClr val="lt1"/>
-                        </a:solidFill>
-                        <a:ln w="6350">
-                          <a:noFill/>
-                        </a:ln>
-                      </wps:spPr>
-                      <wps:txbx>
-                        <w:txbxContent>
-                          <w:p>
-                            <w:r>
-                              <w:t xml:space="preserve">Al momento non è presente un server DHCP, si è resa necessaria la configurazione statica per ogni singolo </w:t>
-                            </w:r>
-                            <w:proofErr w:type="spellStart"/>
-                            <w:r>
-                              <w:t>host</w:t>
-                            </w:r>
-                            <w:proofErr w:type="spellEnd"/>
-                            <w:r>
-                              <w:t xml:space="preserve"> presente nella rete, seguendo la tabella degli indirizzamenti del paragrafo 2.2</w:t>
-                            </w:r>
-                          </w:p>
-                        </w:txbxContent>
-                      </wps:txbx>
-                      <wps:bodyPr rot="0" spcFirstLastPara="0" vertOverflow="overflow" horzOverflow="overflow" vert="horz" wrap="square" lIns="91440" tIns="45720" rIns="91440" bIns="45720" numCol="1" spcCol="0" rtlCol="0" fromWordArt="0" anchor="t" anchorCtr="0" forceAA="0" compatLnSpc="1">
-                        <a:prstTxWarp prst="textNoShape">
-                          <a:avLst/>
-                        </a:prstTxWarp>
-                        <a:noAutofit/>
-                      </wps:bodyPr>
-                    </wps:wsp>
-                  </a:graphicData>
-                </a:graphic>
-                <wp14:sizeRelH relativeFrom="margin">
-                  <wp14:pctWidth>0</wp14:pctWidth>
-                </wp14:sizeRelH>
-                <wp14:sizeRelV relativeFrom="margin">
-                  <wp14:pctHeight>0</wp14:pctHeight>
-                </wp14:sizeRelV>
-              </wp:anchor>
-            </w:drawing>
-          </mc:Choice>
-          <mc:Fallback>
-            <w:pict>
-              <v:shapetype id="_x0000_t202" coordsize="21600,21600" o:spt="202" path="m,l,21600r21600,l21600,xe">
-                <v:stroke joinstyle="miter"/>
-                <v:path gradientshapeok="t" o:connecttype="rect"/>
-              </v:shapetype>
-              <v:shape id="Casella di testo 3" o:spid="_x0000_s1026" type="#_x0000_t202" style="position:absolute;margin-left:256.75pt;margin-top:24.95pt;width:258.4pt;height:66.55pt;z-index:251659264;visibility:visible;mso-wrap-style:square;mso-width-percent:0;mso-height-percent:0;mso-wrap-distance-left:9pt;mso-wrap-distance-top:0;mso-wrap-distance-right:9pt;mso-wrap-distance-bottom:0;mso-position-horizontal:absolute;mso-position-horizontal-relative:text;mso-position-vertical:absolute;mso-position-vertical-relative:text;mso-width-percent:0;mso-height-percent:0;mso-width-relative:margin;mso-height-relative:margin;v-text-anchor:top" o:gfxdata="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" fillcolor="white [3201]" stroked="f" strokeweight=".5pt">
-                <v:textbox>
-                  <w:txbxContent>
-                    <w:p>
-                      <w:r>
-                        <w:t xml:space="preserve">Al momento non è presente un server DHCP, si è resa necessaria la configurazione statica per ogni singolo </w:t>
-                      </w:r>
-                      <w:proofErr w:type="spellStart"/>
-                      <w:r>
-                        <w:t>host</w:t>
-                      </w:r>
-                      <w:proofErr w:type="spellEnd"/>
-                      <w:r>
-                        <w:t xml:space="preserve"> presente nella rete, seguendo la tabella degli indirizzamenti del paragrafo 2.2</w:t>
-                      </w:r>
-                    </w:p>
-                  </w:txbxContent>
-                </v:textbox>
-              </v:shape>
-            </w:pict>
-          </mc:Fallback>
-        </mc:AlternateContent>
-      </w:r>
-    </w:p>
+    <w:p/>
     <w:p>
       <w:r>
         <w:rPr>
@@ -2752,8 +2626,8 @@
         </w:rPr>
         <w:drawing>
           <wp:inline distT="0" distB="0" distL="0" distR="0">
-            <wp:extent cx="4354160" cy="3776400"/>
-            <wp:effectExtent l="0" t="0" r="2540" b="0"/>
+            <wp:extent cx="4353033" cy="2966114"/>
+            <wp:effectExtent l="0" t="0" r="3175" b="5715"/>
             <wp:docPr id="2" name="Immagine 2"/>
             <wp:cNvGraphicFramePr>
               <a:graphicFrameLocks xmlns:a="http://schemas.openxmlformats.org/drawingml/2006/main" noChangeAspect="1"/>
@@ -2773,13 +2647,13 @@
                         </a:ext>
                       </a:extLst>
                     </a:blip>
-                    <a:srcRect t="5588" r="13262" b="28750"/>
+                    <a:srcRect t="7067" r="13262" b="41346"/>
                     <a:stretch/>
                   </pic:blipFill>
                   <pic:spPr bwMode="auto">
                     <a:xfrm>
                       <a:off x="0" y="0"/>
-                      <a:ext cx="4354160" cy="3776400"/>
+                      <a:ext cx="4354160" cy="2966882"/>
                     </a:xfrm>
                     <a:prstGeom prst="rect">
                       <a:avLst/>
@@ -2801,15 +2675,33 @@
       </w:r>
     </w:p>
     <w:p>
+      <w:r>
+        <w:t xml:space="preserve">Al momento non è presente un server DHCP, si è resa necessaria la configurazione statica per ogni singolo </w:t>
+      </w:r>
+      <w:proofErr w:type="spellStart"/>
+      <w:r>
+        <w:t>host</w:t>
+      </w:r>
+      <w:proofErr w:type="spellEnd"/>
+      <w:r>
+        <w:t xml:space="preserve"> presente nella rete, seguendo la tabella degli indirizzamenti del paragrafo 2.2</w:t>
+      </w:r>
+    </w:p>
+    <w:p>
+      <w:r>
+        <w:br w:type="page"/>
+      </w:r>
+    </w:p>
+    <w:p>
       <w:pPr>
         <w:pStyle w:val="Titolo2"/>
       </w:pPr>
-      <w:bookmarkStart w:id="7" w:name="_Toc226714196"/>
+      <w:bookmarkStart w:id="6" w:name="_Toc226714196"/>
       <w:r>
         <w:lastRenderedPageBreak/>
         <w:t>Configurazione Switch</w:t>
       </w:r>
-      <w:bookmarkEnd w:id="7"/>
+      <w:bookmarkEnd w:id="6"/>
       <w:r>
         <w:t xml:space="preserve"> </w:t>
       </w:r>
@@ -2822,8 +2714,8 @@
         </w:rPr>
         <w:drawing>
           <wp:inline distT="0" distB="0" distL="0" distR="0">
-            <wp:extent cx="6184900" cy="5231130"/>
-            <wp:effectExtent l="0" t="0" r="0" b="1270"/>
+            <wp:extent cx="5878830" cy="1594671"/>
+            <wp:effectExtent l="0" t="0" r="1270" b="5715"/>
             <wp:docPr id="4" name="Immagine 4"/>
             <wp:cNvGraphicFramePr>
               <a:graphicFrameLocks xmlns:a="http://schemas.openxmlformats.org/drawingml/2006/main" noChangeAspect="1"/>
@@ -2835,7 +2727,7 @@
                     <pic:cNvPr id="4" name="Screenshot 2026-04-10 alle 10.17.27.png"/>
                     <pic:cNvPicPr/>
                   </pic:nvPicPr>
-                  <pic:blipFill>
+                  <pic:blipFill rotWithShape="1">
                     <a:blip r:embed="rId10" cstate="print">
                       <a:extLst>
                         <a:ext uri="{28A0092B-C50C-407E-A947-70E740481C1C}">
@@ -2843,18 +2735,25 @@
                         </a:ext>
                       </a:extLst>
                     </a:blip>
-                    <a:stretch>
-                      <a:fillRect/>
-                    </a:stretch>
+                    <a:srcRect t="17962" b="49966"/>
+                    <a:stretch/>
                   </pic:blipFill>
-                  <pic:spPr>
+                  <pic:spPr bwMode="auto">
                     <a:xfrm>
                       <a:off x="0" y="0"/>
-                      <a:ext cx="6184900" cy="5231130"/>
+                      <a:ext cx="5931262" cy="1608894"/>
                     </a:xfrm>
                     <a:prstGeom prst="rect">
                       <a:avLst/>
                     </a:prstGeom>
+                    <a:ln>
+                      <a:noFill/>
+                    </a:ln>
+                    <a:extLst>
+                      <a:ext uri="{53640926-AAD7-44D8-BBD7-CCE9431645EC}">
+                        <a14:shadowObscured xmlns:a14="http://schemas.microsoft.com/office/drawing/2010/main"/>
+                      </a:ext>
+                    </a:extLst>
                   </pic:spPr>
                 </pic:pic>
               </a:graphicData>
@@ -2896,12 +2795,76 @@
         <w:t>.</w:t>
       </w:r>
       <w:r>
-        <w:t xml:space="preserve"> </w:t>
+        <w:t xml:space="preserve"> Questa configurazione è essenziale per il trasporto simultaneo di più </w:t>
+      </w:r>
+      <w:proofErr w:type="spellStart"/>
+      <w:r>
+        <w:t>Vlan</w:t>
+      </w:r>
+      <w:proofErr w:type="spellEnd"/>
+      <w:r>
+        <w:t xml:space="preserve"> su un unico collegamento fisico.</w:t>
+      </w:r>
+    </w:p>
+    <w:p/>
+    <w:p>
+      <w:r>
+        <w:rPr>
+          <w:noProof/>
+        </w:rPr>
+        <w:drawing>
+          <wp:inline distT="0" distB="0" distL="0" distR="0">
+            <wp:extent cx="6184679" cy="2062627"/>
+            <wp:effectExtent l="0" t="0" r="635" b="0"/>
+            <wp:docPr id="8" name="Immagine 8"/>
+            <wp:cNvGraphicFramePr>
+              <a:graphicFrameLocks xmlns:a="http://schemas.openxmlformats.org/drawingml/2006/main" noChangeAspect="1"/>
+            </wp:cNvGraphicFramePr>
+            <a:graphic xmlns:a="http://schemas.openxmlformats.org/drawingml/2006/main">
+              <a:graphicData uri="http://schemas.openxmlformats.org/drawingml/2006/picture">
+                <pic:pic xmlns:pic="http://schemas.openxmlformats.org/drawingml/2006/picture">
+                  <pic:nvPicPr>
+                    <pic:cNvPr id="8" name="Screenshot 2026-04-12 alle 10.14.16.png"/>
+                    <pic:cNvPicPr/>
+                  </pic:nvPicPr>
+                  <pic:blipFill rotWithShape="1">
+                    <a:blip r:embed="rId11" cstate="print">
+                      <a:extLst>
+                        <a:ext uri="{28A0092B-C50C-407E-A947-70E740481C1C}">
+                          <a14:useLocalDpi xmlns:a14="http://schemas.microsoft.com/office/drawing/2010/main" val="0"/>
+                        </a:ext>
+                      </a:extLst>
+                    </a:blip>
+                    <a:srcRect t="8805" b="48493"/>
+                    <a:stretch/>
+                  </pic:blipFill>
+                  <pic:spPr bwMode="auto">
+                    <a:xfrm>
+                      <a:off x="0" y="0"/>
+                      <a:ext cx="6184900" cy="2062701"/>
+                    </a:xfrm>
+                    <a:prstGeom prst="rect">
+                      <a:avLst/>
+                    </a:prstGeom>
+                    <a:ln>
+                      <a:noFill/>
+                    </a:ln>
+                    <a:extLst>
+                      <a:ext uri="{53640926-AAD7-44D8-BBD7-CCE9431645EC}">
+                        <a14:shadowObscured xmlns:a14="http://schemas.microsoft.com/office/drawing/2010/main"/>
+                      </a:ext>
+                    </a:extLst>
+                  </pic:spPr>
+                </pic:pic>
+              </a:graphicData>
+            </a:graphic>
+          </wp:inline>
+        </w:drawing>
       </w:r>
     </w:p>
     <w:p>
       <w:r>
-        <w:t xml:space="preserve">Questa configurazione è essenziale per il trasporto simultaneo di più </w:t>
+        <w:t xml:space="preserve">Andiamo adesso a creare la </w:t>
       </w:r>
       <w:proofErr w:type="spellStart"/>
       <w:r>
@@ -2909,7 +2872,15 @@
       </w:r>
       <w:proofErr w:type="spellEnd"/>
       <w:r>
-        <w:t xml:space="preserve"> su un unico collegamento fisico.</w:t>
+        <w:t xml:space="preserve"> list all’interno degli </w:t>
+      </w:r>
+      <w:proofErr w:type="spellStart"/>
+      <w:r>
+        <w:t>switch</w:t>
+      </w:r>
+      <w:proofErr w:type="spellEnd"/>
+      <w:r>
+        <w:t>, seguendo l’indirizzamento della tabella IP.</w:t>
       </w:r>
     </w:p>
     <w:p>
@@ -2917,16 +2888,184 @@
         <w:br w:type="page"/>
       </w:r>
     </w:p>
+    <w:p/>
+    <w:p/>
     <w:p>
+      <w:r>
+        <w:rPr>
+          <w:noProof/>
+        </w:rPr>
+        <w:drawing>
+          <wp:inline distT="0" distB="0" distL="0" distR="0">
+            <wp:extent cx="5868279" cy="2381412"/>
+            <wp:effectExtent l="0" t="0" r="0" b="6350"/>
+            <wp:docPr id="10" name="Immagine 10"/>
+            <wp:cNvGraphicFramePr>
+              <a:graphicFrameLocks xmlns:a="http://schemas.openxmlformats.org/drawingml/2006/main" noChangeAspect="1"/>
+            </wp:cNvGraphicFramePr>
+            <a:graphic xmlns:a="http://schemas.openxmlformats.org/drawingml/2006/main">
+              <a:graphicData uri="http://schemas.openxmlformats.org/drawingml/2006/picture">
+                <pic:pic xmlns:pic="http://schemas.openxmlformats.org/drawingml/2006/picture">
+                  <pic:nvPicPr>
+                    <pic:cNvPr id="10" name="Screenshot 2026-04-12 alle 10.28.31.png"/>
+                    <pic:cNvPicPr/>
+                  </pic:nvPicPr>
+                  <pic:blipFill rotWithShape="1">
+                    <a:blip r:embed="rId12" cstate="print">
+                      <a:extLst>
+                        <a:ext uri="{28A0092B-C50C-407E-A947-70E740481C1C}">
+                          <a14:useLocalDpi xmlns:a14="http://schemas.microsoft.com/office/drawing/2010/main" val="0"/>
+                        </a:ext>
+                      </a:extLst>
+                    </a:blip>
+                    <a:srcRect t="37402" r="5105" b="14175"/>
+                    <a:stretch/>
+                  </pic:blipFill>
+                  <pic:spPr bwMode="auto">
+                    <a:xfrm>
+                      <a:off x="0" y="0"/>
+                      <a:ext cx="5869172" cy="2381774"/>
+                    </a:xfrm>
+                    <a:prstGeom prst="rect">
+                      <a:avLst/>
+                    </a:prstGeom>
+                    <a:ln>
+                      <a:noFill/>
+                    </a:ln>
+                    <a:extLst>
+                      <a:ext uri="{53640926-AAD7-44D8-BBD7-CCE9431645EC}">
+                        <a14:shadowObscured xmlns:a14="http://schemas.microsoft.com/office/drawing/2010/main"/>
+                      </a:ext>
+                    </a:extLst>
+                  </pic:spPr>
+                </pic:pic>
+              </a:graphicData>
+            </a:graphic>
+          </wp:inline>
+        </w:drawing>
+      </w:r>
+    </w:p>
+    <w:p>
+      <w:r>
+        <w:t xml:space="preserve"> </w:t>
+      </w:r>
+      <w:r>
+        <w:rPr>
+          <w:noProof/>
+        </w:rPr>
+        <w:drawing>
+          <wp:inline distT="0" distB="0" distL="0" distR="0" wp14:anchorId="70899DA6" wp14:editId="6A71DEF1">
+            <wp:extent cx="5858510" cy="2870554"/>
+            <wp:effectExtent l="0" t="0" r="0" b="0"/>
+            <wp:docPr id="11" name="Immagine 11"/>
+            <wp:cNvGraphicFramePr>
+              <a:graphicFrameLocks xmlns:a="http://schemas.openxmlformats.org/drawingml/2006/main" noChangeAspect="1"/>
+            </wp:cNvGraphicFramePr>
+            <a:graphic xmlns:a="http://schemas.openxmlformats.org/drawingml/2006/main">
+              <a:graphicData uri="http://schemas.openxmlformats.org/drawingml/2006/picture">
+                <pic:pic xmlns:pic="http://schemas.openxmlformats.org/drawingml/2006/picture">
+                  <pic:nvPicPr>
+                    <pic:cNvPr id="11" name="Screenshot 2026-04-12 alle 10.29.08.png"/>
+                    <pic:cNvPicPr/>
+                  </pic:nvPicPr>
+                  <pic:blipFill rotWithShape="1">
+                    <a:blip r:embed="rId13">
+                      <a:extLst>
+                        <a:ext uri="{28A0092B-C50C-407E-A947-70E740481C1C}">
+                          <a14:useLocalDpi xmlns:a14="http://schemas.microsoft.com/office/drawing/2010/main" val="0"/>
+                        </a:ext>
+                      </a:extLst>
+                    </a:blip>
+                    <a:srcRect t="27064" r="5255" b="15395"/>
+                    <a:stretch/>
+                  </pic:blipFill>
+                  <pic:spPr bwMode="auto">
+                    <a:xfrm>
+                      <a:off x="0" y="0"/>
+                      <a:ext cx="5859861" cy="2871216"/>
+                    </a:xfrm>
+                    <a:prstGeom prst="rect">
+                      <a:avLst/>
+                    </a:prstGeom>
+                    <a:ln>
+                      <a:noFill/>
+                    </a:ln>
+                    <a:extLst>
+                      <a:ext uri="{53640926-AAD7-44D8-BBD7-CCE9431645EC}">
+                        <a14:shadowObscured xmlns:a14="http://schemas.microsoft.com/office/drawing/2010/main"/>
+                      </a:ext>
+                    </a:extLst>
+                  </pic:spPr>
+                </pic:pic>
+              </a:graphicData>
+            </a:graphic>
+          </wp:inline>
+        </w:drawing>
+      </w:r>
+    </w:p>
+    <w:p>
+      <w:r>
+        <w:t xml:space="preserve">Completata la creazione delle </w:t>
+      </w:r>
+      <w:proofErr w:type="spellStart"/>
+      <w:r>
+        <w:t>Vlan</w:t>
+      </w:r>
+      <w:proofErr w:type="spellEnd"/>
+      <w:r>
+        <w:t xml:space="preserve">, andiamo ad assegnarle facendo un </w:t>
+      </w:r>
+      <w:proofErr w:type="spellStart"/>
+      <w:r>
+        <w:t>port</w:t>
+      </w:r>
+      <w:proofErr w:type="spellEnd"/>
+      <w:r>
+        <w:t xml:space="preserve"> </w:t>
+      </w:r>
+      <w:proofErr w:type="spellStart"/>
+      <w:r>
+        <w:t>mapping</w:t>
+      </w:r>
+      <w:proofErr w:type="spellEnd"/>
+      <w:r>
+        <w:t xml:space="preserve"> tra i dispositivi collegati e la segmentazione che vogliamo ottenere. </w:t>
+      </w:r>
+    </w:p>
+    <w:p>
+      <w:r>
+        <w:t xml:space="preserve">Analizzando lo stato dell’interfaccia verifichiamo anche il </w:t>
+      </w:r>
+      <w:proofErr w:type="spellStart"/>
+      <w:r>
+        <w:t>trunk</w:t>
+      </w:r>
+      <w:proofErr w:type="spellEnd"/>
+      <w:r>
+        <w:t xml:space="preserve"> sulla porta di collegamento tra i due </w:t>
+      </w:r>
+      <w:proofErr w:type="spellStart"/>
+      <w:r>
+        <w:t>switch</w:t>
+      </w:r>
+      <w:proofErr w:type="spellEnd"/>
+      <w:r>
+        <w:t xml:space="preserve">. </w:t>
+      </w:r>
+      <w:r>
+        <w:br w:type="page"/>
+      </w:r>
+    </w:p>
+    <w:p>
       <w:pPr>
         <w:pStyle w:val="Titolo1"/>
       </w:pPr>
-      <w:bookmarkStart w:id="8" w:name="_Toc226714197"/>
+      <w:bookmarkStart w:id="7" w:name="_Toc226714197"/>
       <w:r>
         <w:lastRenderedPageBreak/>
         <w:t>Test di funzionamento</w:t>
       </w:r>
-      <w:bookmarkEnd w:id="8"/>
+      <w:bookmarkEnd w:id="7"/>
       <w:r>
         <w:t xml:space="preserve"> </w:t>
       </w:r>
@@ -2953,7 +3092,7 @@
                     <pic:cNvPicPr/>
                   </pic:nvPicPr>
                   <pic:blipFill>
-                    <a:blip r:embed="rId11" cstate="print">
+                    <a:blip r:embed="rId14" cstate="print">
                       <a:extLst>
                         <a:ext uri="{28A0092B-C50C-407E-A947-70E740481C1C}">
                           <a14:useLocalDpi xmlns:a14="http://schemas.microsoft.com/office/drawing/2010/main" val="0"/>
@@ -3005,9 +3144,9 @@
         </w:rPr>
         <w:drawing>
           <wp:inline distT="0" distB="0" distL="0" distR="0">
-            <wp:extent cx="5411603" cy="4107600"/>
-            <wp:effectExtent l="0" t="0" r="0" b="0"/>
-            <wp:docPr id="6" name="Immagine 6"/>
+            <wp:extent cx="6184880" cy="4221125"/>
+            <wp:effectExtent l="0" t="0" r="635" b="0"/>
+            <wp:docPr id="12" name="Immagine 12"/>
             <wp:cNvGraphicFramePr>
               <a:graphicFrameLocks xmlns:a="http://schemas.openxmlformats.org/drawingml/2006/main" noChangeAspect="1"/>
             </wp:cNvGraphicFramePr>
@@ -3015,29 +3154,36 @@
               <a:graphicData uri="http://schemas.openxmlformats.org/drawingml/2006/picture">
                 <pic:pic xmlns:pic="http://schemas.openxmlformats.org/drawingml/2006/picture">
                   <pic:nvPicPr>
-                    <pic:cNvPr id="6" name="Screenshot 2026-04-10 alle 10.14.54.png"/>
+                    <pic:cNvPr id="12" name="Screenshot 2026-04-12 alle 10.34.31.png"/>
                     <pic:cNvPicPr/>
                   </pic:nvPicPr>
-                  <pic:blipFill>
-                    <a:blip r:embed="rId12" cstate="print">
+                  <pic:blipFill rotWithShape="1">
+                    <a:blip r:embed="rId15">
                       <a:extLst>
                         <a:ext uri="{28A0092B-C50C-407E-A947-70E740481C1C}">
                           <a14:useLocalDpi xmlns:a14="http://schemas.microsoft.com/office/drawing/2010/main" val="0"/>
                         </a:ext>
                       </a:extLst>
                     </a:blip>
-                    <a:stretch>
-                      <a:fillRect/>
-                    </a:stretch>
+                    <a:srcRect t="28743" b="6422"/>
+                    <a:stretch/>
                   </pic:blipFill>
-                  <pic:spPr>
+                  <pic:spPr bwMode="auto">
                     <a:xfrm>
                       <a:off x="0" y="0"/>
-                      <a:ext cx="5411603" cy="4107600"/>
+                      <a:ext cx="6184900" cy="4221139"/>
                     </a:xfrm>
                     <a:prstGeom prst="rect">
                       <a:avLst/>
                     </a:prstGeom>
+                    <a:ln>
+                      <a:noFill/>
+                    </a:ln>
+                    <a:extLst>
+                      <a:ext uri="{53640926-AAD7-44D8-BBD7-CCE9431645EC}">
+                        <a14:shadowObscured xmlns:a14="http://schemas.microsoft.com/office/drawing/2010/main"/>
+                      </a:ext>
+                    </a:extLst>
                   </pic:spPr>
                 </pic:pic>
               </a:graphicData>
@@ -3061,8 +3207,18 @@
       </w:r>
       <w:proofErr w:type="spellEnd"/>
       <w:r>
-        <w:t xml:space="preserve"> situati in piani diversi</w:t>
-      </w:r>
+        <w:t xml:space="preserve"> situati in </w:t>
+      </w:r>
+      <w:proofErr w:type="spellStart"/>
+      <w:r>
+        <w:t>Vlan</w:t>
+      </w:r>
+      <w:proofErr w:type="spellEnd"/>
+      <w:r>
+        <w:t xml:space="preserve"> diverse</w:t>
+      </w:r>
+      <w:bookmarkStart w:id="8" w:name="_GoBack"/>
+      <w:bookmarkEnd w:id="8"/>
       <w:r>
         <w:t xml:space="preserve"> con esito positivo. </w:t>
       </w:r>
@@ -3142,11 +3298,11 @@
         <w:t xml:space="preserve">Inoltre, </w:t>
       </w:r>
       <w:r>
-        <w:t>la corretta configurazione del Q</w:t>
+        <w:t xml:space="preserve">la corretta configurazione del </w:t>
       </w:r>
       <w:proofErr w:type="spellStart"/>
       <w:r>
-        <w:t>oS</w:t>
+        <w:t>QoS</w:t>
       </w:r>
       <w:proofErr w:type="spellEnd"/>
       <w:r>
@@ -3167,7 +3323,7 @@
       </w:r>
     </w:p>
     <w:sectPr>
-      <w:footerReference w:type="default" r:id="rId13"/>
+      <w:footerReference w:type="default" r:id="rId16"/>
       <w:pgSz w:w="11900" w:h="16840"/>
       <w:pgMar w:top="1440" w:right="1080" w:bottom="1440" w:left="1080" w:header="454" w:footer="708" w:gutter="0"/>
       <w:cols w:space="708"/>
@@ -5402,7 +5558,7 @@
 </file>
 
 <file path=customXml/itemProps1.xml><?xml version="1.0" encoding="utf-8"?>
-<ds:datastoreItem xmlns:ds="http://schemas.openxmlformats.org/officeDocument/2006/customXml" ds:itemID="{956617B8-D89B-124A-8B83-B054F75115F7}">
+<ds:datastoreItem xmlns:ds="http://schemas.openxmlformats.org/officeDocument/2006/customXml" ds:itemID="{DE85C0CB-7339-534B-BBEB-582507422B99}">
   <ds:schemaRefs>
     <ds:schemaRef ds:uri="http://schemas.openxmlformats.org/officeDocument/2006/bibliography"/>
   </ds:schemaRefs>

</xml_diff>